<commit_message>
Refactor: Expanding reward design functions with distinct failure mode targeting
</commit_message>
<xml_diff>
--- a/Document/ML: AI Research Internship_AfterQuery.docx
+++ b/Document/ML: AI Research Internship_AfterQuery.docx
@@ -130,7 +130,7 @@
       <w:pPr>
         <w:pStyle w:val="ListParagraph"/>
         <w:rPr>
-          <w:rFonts w:ascii="Times New Roman" w:hAnsi="Times New Roman" w:cs="Times New Roman" w:hint="cs"/>
+          <w:rFonts w:ascii="Times New Roman" w:hAnsi="Times New Roman" w:cs="Times New Roman"/>
         </w:rPr>
       </w:pPr>
     </w:p>
@@ -142,7 +142,7 @@
           <w:numId w:val="1"/>
         </w:numPr>
         <w:rPr>
-          <w:rFonts w:ascii="Times New Roman" w:hAnsi="Times New Roman" w:cs="Times New Roman" w:hint="cs"/>
+          <w:rFonts w:ascii="Times New Roman" w:hAnsi="Times New Roman" w:cs="Times New Roman"/>
         </w:rPr>
       </w:pPr>
       <w:r>
@@ -204,6 +204,12 @@
           <w:rFonts w:ascii="Times New Roman" w:hAnsi="Times New Roman" w:cs="Times New Roman" w:hint="cs"/>
         </w:rPr>
         <w:t xml:space="preserve"> </w:t>
+      </w:r>
+      <w:r>
+        <w:rPr>
+          <w:rFonts w:ascii="Times New Roman" w:hAnsi="Times New Roman" w:cs="Times New Roman"/>
+        </w:rPr>
+        <w:t xml:space="preserve">approach with </w:t>
       </w:r>
       <w:r>
         <w:rPr>
@@ -232,7 +238,7 @@
           <w:numId w:val="1"/>
         </w:numPr>
         <w:rPr>
-          <w:rFonts w:ascii="Times New Roman" w:hAnsi="Times New Roman" w:cs="Times New Roman" w:hint="cs"/>
+          <w:rFonts w:ascii="Times New Roman" w:hAnsi="Times New Roman" w:cs="Times New Roman"/>
           <w:b/>
           <w:bCs/>
           <w:u w:val="single"/>
@@ -324,7 +330,7 @@
       <w:pPr>
         <w:pStyle w:val="ListParagraph"/>
         <w:rPr>
-          <w:rFonts w:ascii="Times New Roman" w:hAnsi="Times New Roman" w:cs="Times New Roman" w:hint="cs"/>
+          <w:rFonts w:ascii="Times New Roman" w:hAnsi="Times New Roman" w:cs="Times New Roman"/>
         </w:rPr>
       </w:pPr>
       <w:r>
@@ -414,7 +420,7 @@
       <w:pPr>
         <w:pStyle w:val="ListParagraph"/>
         <w:rPr>
-          <w:rFonts w:ascii="Times New Roman" w:hAnsi="Times New Roman" w:cs="Times New Roman" w:hint="cs"/>
+          <w:rFonts w:ascii="Times New Roman" w:hAnsi="Times New Roman" w:cs="Times New Roman"/>
         </w:rPr>
       </w:pPr>
     </w:p>
@@ -422,7 +428,7 @@
       <w:pPr>
         <w:pStyle w:val="ListParagraph"/>
         <w:rPr>
-          <w:rFonts w:ascii="Times New Roman" w:hAnsi="Times New Roman" w:cs="Times New Roman" w:hint="cs"/>
+          <w:rFonts w:ascii="Times New Roman" w:hAnsi="Times New Roman" w:cs="Times New Roman"/>
         </w:rPr>
       </w:pPr>
       <w:r>
@@ -504,7 +510,7 @@
       <w:pPr>
         <w:pStyle w:val="ListParagraph"/>
         <w:rPr>
-          <w:rFonts w:ascii="Times New Roman" w:hAnsi="Times New Roman" w:cs="Times New Roman" w:hint="cs"/>
+          <w:rFonts w:ascii="Times New Roman" w:hAnsi="Times New Roman" w:cs="Times New Roman"/>
         </w:rPr>
       </w:pPr>
     </w:p>
@@ -512,7 +518,7 @@
       <w:pPr>
         <w:pStyle w:val="ListParagraph"/>
         <w:rPr>
-          <w:rFonts w:ascii="Times New Roman" w:hAnsi="Times New Roman" w:cs="Times New Roman" w:hint="cs"/>
+          <w:rFonts w:ascii="Times New Roman" w:hAnsi="Times New Roman" w:cs="Times New Roman"/>
         </w:rPr>
       </w:pPr>
       <w:r>
@@ -558,7 +564,7 @@
       <w:pPr>
         <w:pStyle w:val="ListParagraph"/>
         <w:rPr>
-          <w:rFonts w:ascii="Times New Roman" w:hAnsi="Times New Roman" w:cs="Times New Roman" w:hint="cs"/>
+          <w:rFonts w:ascii="Times New Roman" w:hAnsi="Times New Roman" w:cs="Times New Roman"/>
           <w:b/>
           <w:bCs/>
         </w:rPr>
@@ -596,7 +602,7 @@
       <w:pPr>
         <w:pStyle w:val="ListParagraph"/>
         <w:rPr>
-          <w:rFonts w:ascii="Times New Roman" w:hAnsi="Times New Roman" w:cs="Times New Roman" w:hint="cs"/>
+          <w:rFonts w:ascii="Times New Roman" w:hAnsi="Times New Roman" w:cs="Times New Roman"/>
         </w:rPr>
       </w:pPr>
       <w:r>
@@ -624,7 +630,7 @@
       <w:pPr>
         <w:pStyle w:val="ListParagraph"/>
         <w:rPr>
-          <w:rFonts w:ascii="Times New Roman" w:hAnsi="Times New Roman" w:cs="Times New Roman" w:hint="cs"/>
+          <w:rFonts w:ascii="Times New Roman" w:hAnsi="Times New Roman" w:cs="Times New Roman"/>
         </w:rPr>
       </w:pPr>
     </w:p>
@@ -658,31 +664,20 @@
           <w:rFonts w:ascii="Times New Roman" w:hAnsi="Times New Roman" w:cs="Times New Roman" w:hint="cs"/>
         </w:rPr>
         <w:br/>
-      </w:r>
-      <w:r>
-        <w:rPr>
-          <w:rFonts w:ascii="Times New Roman" w:hAnsi="Times New Roman" w:cs="Times New Roman" w:hint="cs"/>
-        </w:rPr>
         <w:t>Orchestrates the active training loop.</w:t>
       </w:r>
       <w:r>
         <w:rPr>
           <w:rFonts w:ascii="Times New Roman" w:hAnsi="Times New Roman" w:cs="Times New Roman" w:hint="cs"/>
         </w:rPr>
-        <w:t xml:space="preserve"> </w:t>
-      </w:r>
-      <w:r>
-        <w:rPr>
-          <w:rFonts w:ascii="Times New Roman" w:hAnsi="Times New Roman" w:cs="Times New Roman" w:hint="cs"/>
-        </w:rPr>
-        <w:t>Manages gradient accumulation, memory-efficient loading, and checkpoint saving.</w:t>
+        <w:t xml:space="preserve"> Manages gradient accumulation, memory-efficient loading, and checkpoint saving.</w:t>
       </w:r>
     </w:p>
     <w:p>
       <w:pPr>
         <w:pStyle w:val="ListParagraph"/>
         <w:rPr>
-          <w:rFonts w:ascii="Times New Roman" w:hAnsi="Times New Roman" w:cs="Times New Roman" w:hint="cs"/>
+          <w:rFonts w:ascii="Times New Roman" w:hAnsi="Times New Roman" w:cs="Times New Roman"/>
         </w:rPr>
       </w:pPr>
     </w:p>
@@ -690,7 +685,7 @@
       <w:pPr>
         <w:pStyle w:val="ListParagraph"/>
         <w:rPr>
-          <w:rFonts w:ascii="Times New Roman" w:hAnsi="Times New Roman" w:cs="Times New Roman" w:hint="cs"/>
+          <w:rFonts w:ascii="Times New Roman" w:hAnsi="Times New Roman" w:cs="Times New Roman"/>
           <w:b/>
           <w:bCs/>
         </w:rPr>
@@ -725,19 +720,7 @@
         <w:rPr>
           <w:rFonts w:ascii="Times New Roman" w:hAnsi="Times New Roman" w:cs="Times New Roman" w:hint="cs"/>
         </w:rPr>
-        <w:t xml:space="preserve">An isolated inference script that loads the fine-tuned </w:t>
-      </w:r>
-      <w:r>
-        <w:rPr>
-          <w:rFonts w:ascii="Times New Roman" w:hAnsi="Times New Roman" w:cs="Times New Roman" w:hint="cs"/>
-        </w:rPr>
-        <w:t xml:space="preserve">model </w:t>
-      </w:r>
-      <w:r>
-        <w:rPr>
-          <w:rFonts w:ascii="Times New Roman" w:hAnsi="Times New Roman" w:cs="Times New Roman" w:hint="cs"/>
-        </w:rPr>
-        <w:t>adapters over the base model to validate trajectory accuracy against unseen test prompts</w:t>
+        <w:t>An isolated inference script that loads the fine-tuned model adapters over the base model to validate trajectory accuracy against unseen test prompts</w:t>
       </w:r>
       <w:r>
         <w:rPr>
@@ -780,7 +763,7 @@
       <w:pPr>
         <w:pStyle w:val="Heading2"/>
         <w:rPr>
-          <w:rFonts w:ascii="Times New Roman" w:hAnsi="Times New Roman" w:cs="Times New Roman" w:hint="cs"/>
+          <w:rFonts w:ascii="Times New Roman" w:hAnsi="Times New Roman" w:cs="Times New Roman"/>
           <w:color w:val="000000" w:themeColor="text1"/>
           <w:sz w:val="24"/>
           <w:szCs w:val="24"/>
@@ -831,38 +814,24 @@
         </w:numPr>
         <w:spacing w:before="60" w:after="60"/>
         <w:rPr>
+          <w:rFonts w:ascii="Times New Roman" w:eastAsia="Calibri" w:hAnsi="Times New Roman" w:cs="Times New Roman"/>
+          <w:color w:val="000000" w:themeColor="text1"/>
+        </w:rPr>
+      </w:pPr>
+      <w:r>
+        <w:rPr>
           <w:rFonts w:ascii="Times New Roman" w:eastAsia="Calibri" w:hAnsi="Times New Roman" w:cs="Times New Roman" w:hint="cs"/>
           <w:color w:val="000000" w:themeColor="text1"/>
-        </w:rPr>
-      </w:pPr>
+          <w:u w:val="single"/>
+        </w:rPr>
+        <w:t>System Prompt:</w:t>
+      </w:r>
       <w:r>
         <w:rPr>
           <w:rFonts w:ascii="Times New Roman" w:eastAsia="Calibri" w:hAnsi="Times New Roman" w:cs="Times New Roman" w:hint="cs"/>
           <w:color w:val="000000" w:themeColor="text1"/>
-          <w:u w:val="single"/>
-        </w:rPr>
-        <w:t>System Prompt:</w:t>
-      </w:r>
-      <w:r>
-        <w:rPr>
-          <w:rFonts w:ascii="Times New Roman" w:eastAsia="Calibri" w:hAnsi="Times New Roman" w:cs="Times New Roman" w:hint="cs"/>
-          <w:color w:val="000000" w:themeColor="text1"/>
-        </w:rPr>
-        <w:t xml:space="preserve"> Contains </w:t>
-      </w:r>
-      <w:r>
-        <w:rPr>
-          <w:rFonts w:ascii="Times New Roman" w:eastAsia="Calibri" w:hAnsi="Times New Roman" w:cs="Times New Roman" w:hint="cs"/>
-          <w:color w:val="000000" w:themeColor="text1"/>
-        </w:rPr>
-        <w:t>Tool registry: names, signatures, and descriptions of all available API functions</w:t>
-      </w:r>
-      <w:r>
-        <w:rPr>
-          <w:rFonts w:ascii="Times New Roman" w:eastAsia="Calibri" w:hAnsi="Times New Roman" w:cs="Times New Roman" w:hint="cs"/>
-          <w:color w:val="000000" w:themeColor="text1"/>
-        </w:rPr>
-        <w:t>.</w:t>
+        </w:rPr>
+        <w:t xml:space="preserve"> Contains Tool registry: names, signatures, and descriptions of all available API functions.</w:t>
       </w:r>
     </w:p>
     <w:p>
@@ -874,39 +843,24 @@
         </w:numPr>
         <w:spacing w:before="60" w:after="60"/>
         <w:rPr>
+          <w:rFonts w:ascii="Times New Roman" w:eastAsia="Calibri" w:hAnsi="Times New Roman" w:cs="Times New Roman"/>
+          <w:color w:val="000000" w:themeColor="text1"/>
+        </w:rPr>
+      </w:pPr>
+      <w:r>
+        <w:rPr>
           <w:rFonts w:ascii="Times New Roman" w:eastAsia="Calibri" w:hAnsi="Times New Roman" w:cs="Times New Roman" w:hint="cs"/>
           <w:color w:val="000000" w:themeColor="text1"/>
-        </w:rPr>
-      </w:pPr>
+          <w:u w:val="single"/>
+        </w:rPr>
+        <w:t>User Utterance:</w:t>
+      </w:r>
       <w:r>
         <w:rPr>
           <w:rFonts w:ascii="Times New Roman" w:eastAsia="Calibri" w:hAnsi="Times New Roman" w:cs="Times New Roman" w:hint="cs"/>
           <w:color w:val="000000" w:themeColor="text1"/>
-          <w:u w:val="single"/>
-        </w:rPr>
-        <w:t>User Utterance</w:t>
-      </w:r>
-      <w:r>
-        <w:rPr>
-          <w:rFonts w:ascii="Times New Roman" w:eastAsia="Calibri" w:hAnsi="Times New Roman" w:cs="Times New Roman" w:hint="cs"/>
-          <w:color w:val="000000" w:themeColor="text1"/>
-          <w:u w:val="single"/>
-        </w:rPr>
-        <w:t>:</w:t>
-      </w:r>
-      <w:r>
-        <w:rPr>
-          <w:rFonts w:ascii="Times New Roman" w:eastAsia="Calibri" w:hAnsi="Times New Roman" w:cs="Times New Roman" w:hint="cs"/>
-          <w:color w:val="000000" w:themeColor="text1"/>
-        </w:rPr>
-        <w:t xml:space="preserve"> contains the</w:t>
-      </w:r>
-      <w:r>
-        <w:rPr>
-          <w:rFonts w:ascii="Times New Roman" w:eastAsia="Calibri" w:hAnsi="Times New Roman" w:cs="Times New Roman" w:hint="cs"/>
-          <w:color w:val="000000" w:themeColor="text1"/>
-        </w:rPr>
-        <w:t xml:space="preserve"> customer service request referencing an order ID and describing an issue</w:t>
+        </w:rPr>
+        <w:t xml:space="preserve"> contains the customer service request referencing an order ID and describing an issue</w:t>
       </w:r>
       <w:r>
         <w:rPr>
@@ -925,22 +879,71 @@
         </w:numPr>
         <w:spacing w:before="60" w:after="60"/>
         <w:rPr>
+          <w:rFonts w:ascii="Times New Roman" w:eastAsia="Calibri" w:hAnsi="Times New Roman" w:cs="Times New Roman"/>
+          <w:color w:val="000000" w:themeColor="text1"/>
+        </w:rPr>
+      </w:pPr>
+      <w:r>
+        <w:rPr>
           <w:rFonts w:ascii="Times New Roman" w:eastAsia="Calibri" w:hAnsi="Times New Roman" w:cs="Times New Roman" w:hint="cs"/>
           <w:color w:val="000000" w:themeColor="text1"/>
-        </w:rPr>
-      </w:pPr>
+          <w:u w:val="single"/>
+        </w:rPr>
+        <w:t>Generation Prompt:</w:t>
+      </w:r>
       <w:r>
         <w:rPr>
           <w:rFonts w:ascii="Times New Roman" w:eastAsia="Calibri" w:hAnsi="Times New Roman" w:cs="Times New Roman" w:hint="cs"/>
           <w:color w:val="000000" w:themeColor="text1"/>
-          <w:u w:val="single"/>
-        </w:rPr>
-        <w:t>Generation Prompt:</w:t>
-      </w:r>
+        </w:rPr>
+        <w:t xml:space="preserve"> The assistant turn start token, signaling the model to begin generating. The Special token: (&lt;|im_start|&gt;assistant)</w:t>
+      </w:r>
+      <w:r>
+        <w:rPr>
+          <w:rFonts w:ascii="Times New Roman" w:eastAsia="Calibri" w:hAnsi="Times New Roman" w:cs="Times New Roman"/>
+          <w:color w:val="000000" w:themeColor="text1"/>
+        </w:rPr>
+        <w:t>.</w:t>
+      </w:r>
+    </w:p>
+    <w:p>
+      <w:pPr>
+        <w:pStyle w:val="ListParagraph"/>
+        <w:spacing w:before="60" w:after="60"/>
+        <w:rPr>
+          <w:rFonts w:ascii="Times New Roman" w:eastAsia="Calibri" w:hAnsi="Times New Roman" w:cs="Times New Roman"/>
+          <w:color w:val="000000" w:themeColor="text1"/>
+          <w:sz w:val="18"/>
+          <w:szCs w:val="18"/>
+        </w:rPr>
+      </w:pPr>
+    </w:p>
+    <w:p>
+      <w:pPr>
+        <w:pStyle w:val="ListParagraph"/>
+        <w:spacing w:before="60" w:after="60"/>
+        <w:rPr>
+          <w:rFonts w:ascii="Times New Roman" w:hAnsi="Times New Roman" w:cs="Times New Roman" w:hint="cs"/>
+          <w:color w:val="000000" w:themeColor="text1"/>
+          <w:sz w:val="22"/>
+          <w:szCs w:val="22"/>
+        </w:rPr>
+      </w:pPr>
       <w:r>
         <w:rPr>
           <w:rFonts w:ascii="Times New Roman" w:eastAsia="Calibri" w:hAnsi="Times New Roman" w:cs="Times New Roman" w:hint="cs"/>
           <w:color w:val="000000" w:themeColor="text1"/>
+          <w:sz w:val="22"/>
+          <w:szCs w:val="22"/>
+        </w:rPr>
+        <w:t>If tool registry exceeds</w:t>
+      </w:r>
+      <w:r>
+        <w:rPr>
+          <w:rFonts w:ascii="Times New Roman" w:eastAsia="Calibri" w:hAnsi="Times New Roman" w:cs="Times New Roman" w:hint="cs"/>
+          <w:color w:val="000000" w:themeColor="text1"/>
+          <w:sz w:val="22"/>
+          <w:szCs w:val="22"/>
         </w:rPr>
         <w:t xml:space="preserve"> </w:t>
       </w:r>
@@ -948,59 +951,52 @@
         <w:rPr>
           <w:rFonts w:ascii="Times New Roman" w:eastAsia="Calibri" w:hAnsi="Times New Roman" w:cs="Times New Roman" w:hint="cs"/>
           <w:color w:val="000000" w:themeColor="text1"/>
-        </w:rPr>
-        <w:t xml:space="preserve">The assistant turn start token, </w:t>
+          <w:sz w:val="22"/>
+          <w:szCs w:val="22"/>
+        </w:rPr>
+        <w:t>2048 token</w:t>
       </w:r>
       <w:r>
         <w:rPr>
           <w:rFonts w:ascii="Times New Roman" w:eastAsia="Calibri" w:hAnsi="Times New Roman" w:cs="Times New Roman" w:hint="cs"/>
           <w:color w:val="000000" w:themeColor="text1"/>
-        </w:rPr>
-        <w:t>signaling</w:t>
+          <w:sz w:val="22"/>
+          <w:szCs w:val="22"/>
+        </w:rPr>
+        <w:t xml:space="preserve"> </w:t>
       </w:r>
       <w:r>
         <w:rPr>
           <w:rFonts w:ascii="Times New Roman" w:eastAsia="Calibri" w:hAnsi="Times New Roman" w:cs="Times New Roman" w:hint="cs"/>
           <w:color w:val="000000" w:themeColor="text1"/>
-        </w:rPr>
-        <w:t xml:space="preserve"> the model to begin generating</w:t>
+          <w:sz w:val="22"/>
+          <w:szCs w:val="22"/>
+        </w:rPr>
+        <w:t xml:space="preserve">context window, tools are ranked by prior usage frequency in the training set and </w:t>
+      </w:r>
+      <w:r>
+        <w:rPr>
+          <w:rFonts w:ascii="Times New Roman" w:hAnsi="Times New Roman" w:cs="Times New Roman" w:hint="cs"/>
+          <w:sz w:val="22"/>
+          <w:szCs w:val="22"/>
+        </w:rPr>
+        <w:t>truncated so that the most task-relevant APIs remain visible to the agent at every step</w:t>
       </w:r>
       <w:r>
         <w:rPr>
           <w:rFonts w:ascii="Times New Roman" w:eastAsia="Calibri" w:hAnsi="Times New Roman" w:cs="Times New Roman" w:hint="cs"/>
           <w:color w:val="000000" w:themeColor="text1"/>
-        </w:rPr>
-        <w:t>. The Special token: (</w:t>
-      </w:r>
-      <w:r>
-        <w:rPr>
-          <w:rFonts w:ascii="Times New Roman" w:eastAsia="Calibri" w:hAnsi="Times New Roman" w:cs="Times New Roman" w:hint="cs"/>
-          <w:color w:val="000000" w:themeColor="text1"/>
-        </w:rPr>
-        <w:t>&lt;|im_start|&gt;assistant)</w:t>
-      </w:r>
-      <w:r>
-        <w:rPr>
-          <w:rFonts w:ascii="Times New Roman" w:eastAsia="Calibri" w:hAnsi="Times New Roman" w:cs="Times New Roman"/>
-          <w:color w:val="000000" w:themeColor="text1"/>
-        </w:rPr>
-        <w:t>.</w:t>
-      </w:r>
-    </w:p>
-    <w:p>
-      <w:pPr>
-        <w:pStyle w:val="ListParagraph"/>
-        <w:rPr>
-          <w:rFonts w:ascii="Times New Roman" w:hAnsi="Times New Roman" w:cs="Times New Roman" w:hint="cs"/>
-          <w:color w:val="000000" w:themeColor="text1"/>
-        </w:rPr>
-      </w:pPr>
+          <w:sz w:val="22"/>
+          <w:szCs w:val="22"/>
+        </w:rPr>
+        <w:t xml:space="preserve">. </w:t>
+      </w:r>
     </w:p>
     <w:p>
       <w:pPr>
         <w:pStyle w:val="Heading2"/>
         <w:rPr>
-          <w:rFonts w:ascii="Times New Roman" w:hAnsi="Times New Roman" w:cs="Times New Roman" w:hint="cs"/>
+          <w:rFonts w:ascii="Times New Roman" w:hAnsi="Times New Roman" w:cs="Times New Roman"/>
           <w:color w:val="000000" w:themeColor="text1"/>
           <w:sz w:val="24"/>
           <w:szCs w:val="24"/>
@@ -1021,6 +1017,9 @@
     <w:p>
       <w:pPr>
         <w:spacing w:before="60" w:after="60"/>
+        <w:rPr>
+          <w:rFonts w:ascii="Times New Roman" w:hAnsi="Times New Roman" w:cs="Times New Roman" w:hint="cs"/>
+        </w:rPr>
       </w:pPr>
       <w:r>
         <w:rPr>
@@ -1031,14 +1030,16 @@
       </w:r>
       <w:r>
         <w:rPr>
-          <w:rFonts w:ascii="Calibri" w:eastAsia="Calibri" w:hAnsi="Calibri" w:cs="Calibri"/>
-          <w:color w:val="374151"/>
-          <w:sz w:val="21"/>
-          <w:szCs w:val="21"/>
+          <w:rFonts w:ascii="Times New Roman" w:eastAsia="Calibri" w:hAnsi="Times New Roman" w:cs="Times New Roman" w:hint="cs"/>
+          <w:color w:val="000000" w:themeColor="text1"/>
         </w:rPr>
         <w:t>An action is considered valid if and only if it satisfies both conditions below:</w:t>
       </w:r>
       <w:r>
+        <w:rPr>
+          <w:rFonts w:ascii="Times New Roman" w:hAnsi="Times New Roman" w:cs="Times New Roman" w:hint="cs"/>
+          <w:color w:val="000000" w:themeColor="text1"/>
+        </w:rPr>
         <w:br/>
       </w:r>
     </w:p>
@@ -1051,7 +1052,7 @@
         </w:numPr>
         <w:spacing w:before="60" w:after="60"/>
         <w:rPr>
-          <w:rFonts w:ascii="Times New Roman" w:hAnsi="Times New Roman" w:cs="Times New Roman" w:hint="cs"/>
+          <w:rFonts w:ascii="Times New Roman" w:hAnsi="Times New Roman" w:cs="Times New Roman"/>
           <w:color w:val="000000" w:themeColor="text1"/>
         </w:rPr>
       </w:pPr>
@@ -1063,34 +1064,34 @@
           <w:color w:val="000000" w:themeColor="text1"/>
         </w:rPr>
         <w:t xml:space="preserve">Structural validity: </w:t>
+      </w:r>
+      <w:r>
+        <w:rPr>
+          <w:rFonts w:ascii="Times New Roman" w:eastAsia="Calibri" w:hAnsi="Times New Roman" w:cs="Times New Roman"/>
+          <w:color w:val="374151"/>
+        </w:rPr>
+        <w:t xml:space="preserve">A schema validator, </w:t>
+      </w:r>
+      <w:r>
+        <w:rPr>
+          <w:rFonts w:ascii="Times New Roman" w:eastAsia="Calibri" w:hAnsi="Times New Roman" w:cs="Times New Roman"/>
+          <w:color w:val="374151"/>
+        </w:rPr>
+        <w:t>zeroing probability mass on any token that would produce malformed JSON</w:t>
+      </w:r>
+      <w:r>
+        <w:rPr>
+          <w:rFonts w:ascii="Times New Roman" w:eastAsia="Calibri" w:hAnsi="Times New Roman" w:cs="Times New Roman"/>
+          <w:color w:val="374151"/>
+        </w:rPr>
+        <w:t xml:space="preserve"> with </w:t>
       </w:r>
       <w:r>
         <w:rPr>
           <w:rFonts w:ascii="Times New Roman" w:eastAsia="Calibri" w:hAnsi="Times New Roman" w:cs="Times New Roman" w:hint="cs"/>
           <w:color w:val="374151"/>
         </w:rPr>
-        <w:t>Output is pars</w:t>
-      </w:r>
-      <w:r>
-        <w:rPr>
-          <w:rFonts w:ascii="Times New Roman" w:eastAsia="Calibri" w:hAnsi="Times New Roman" w:cs="Times New Roman" w:hint="cs"/>
-          <w:color w:val="374151"/>
-        </w:rPr>
-        <w:t>e-</w:t>
-      </w:r>
-      <w:r>
-        <w:rPr>
-          <w:rFonts w:ascii="Times New Roman" w:eastAsia="Calibri" w:hAnsi="Times New Roman" w:cs="Times New Roman" w:hint="cs"/>
-          <w:color w:val="374151"/>
-        </w:rPr>
-        <w:t>able JSON containing a 'name' key and optionally an 'arguments' key</w:t>
-      </w:r>
-      <w:r>
-        <w:rPr>
-          <w:rFonts w:ascii="Times New Roman" w:eastAsia="Calibri" w:hAnsi="Times New Roman" w:cs="Times New Roman" w:hint="cs"/>
-          <w:color w:val="374151"/>
-        </w:rPr>
-        <w:t xml:space="preserve">. </w:t>
+        <w:t xml:space="preserve">parse-able JSON containing a 'name' key and optionally an 'arguments' key. </w:t>
       </w:r>
     </w:p>
     <w:p>
@@ -1102,7 +1103,7 @@
         </w:numPr>
         <w:spacing w:before="60" w:after="60"/>
         <w:rPr>
-          <w:rFonts w:ascii="Times New Roman" w:hAnsi="Times New Roman" w:cs="Times New Roman" w:hint="cs"/>
+          <w:rFonts w:ascii="Times New Roman" w:hAnsi="Times New Roman" w:cs="Times New Roman"/>
           <w:color w:val="000000" w:themeColor="text1"/>
         </w:rPr>
       </w:pPr>
@@ -1124,33 +1125,40 @@
       </w:r>
       <w:r>
         <w:rPr>
-          <w:rFonts w:ascii="Times New Roman" w:eastAsia="Calibri" w:hAnsi="Times New Roman" w:cs="Times New Roman" w:hint="cs"/>
-          <w:color w:val="374151"/>
-        </w:rPr>
-        <w:t xml:space="preserve">The tool name exists in the available tool </w:t>
-      </w:r>
-      <w:proofErr w:type="gramStart"/>
-      <w:r>
-        <w:rPr>
-          <w:rFonts w:ascii="Times New Roman" w:eastAsia="Calibri" w:hAnsi="Times New Roman" w:cs="Times New Roman" w:hint="cs"/>
-          <w:color w:val="374151"/>
-        </w:rPr>
-        <w:t>registry</w:t>
-      </w:r>
-      <w:proofErr w:type="gramEnd"/>
-      <w:r>
-        <w:rPr>
-          <w:rFonts w:ascii="Times New Roman" w:eastAsia="Calibri" w:hAnsi="Times New Roman" w:cs="Times New Roman" w:hint="cs"/>
-          <w:color w:val="374151"/>
-        </w:rPr>
-        <w:t xml:space="preserve"> and the argument types match the tool signature</w:t>
-      </w:r>
-    </w:p>
-    <w:p>
-      <w:pPr>
-        <w:rPr>
-          <w:rFonts w:ascii="Times New Roman" w:hAnsi="Times New Roman" w:cs="Times New Roman" w:hint="cs"/>
-          <w:color w:val="000000" w:themeColor="text1"/>
+          <w:rFonts w:ascii="Times New Roman" w:hAnsi="Times New Roman" w:cs="Times New Roman"/>
+          <w:color w:val="000000" w:themeColor="text1"/>
+        </w:rPr>
+        <w:t xml:space="preserve">requires the tool name to exist in the registry and argument types to match the tool signature. Structurally valid but semantically invalid outputs receive format reward only </w:t>
+      </w:r>
+      <w:r>
+        <w:rPr>
+          <w:rFonts w:ascii="Times New Roman" w:hAnsi="Times New Roman" w:cs="Times New Roman"/>
+          <w:color w:val="000000" w:themeColor="text1"/>
+        </w:rPr>
+        <w:t xml:space="preserve">and </w:t>
+      </w:r>
+      <w:r>
+        <w:rPr>
+          <w:rFonts w:ascii="Times New Roman" w:hAnsi="Times New Roman" w:cs="Times New Roman"/>
+          <w:color w:val="000000" w:themeColor="text1"/>
+        </w:rPr>
+        <w:t>zero</w:t>
+      </w:r>
+      <w:r>
+        <w:rPr>
+          <w:rFonts w:ascii="Times New Roman" w:hAnsi="Times New Roman" w:cs="Times New Roman"/>
+          <w:color w:val="000000" w:themeColor="text1"/>
+        </w:rPr>
+        <w:t xml:space="preserve"> correctness reward.</w:t>
+      </w:r>
+    </w:p>
+    <w:p>
+      <w:pPr>
+        <w:rPr>
+          <w:rFonts w:ascii="Times New Roman" w:hAnsi="Times New Roman" w:cs="Times New Roman"/>
+          <w:color w:val="000000" w:themeColor="text1"/>
+          <w:sz w:val="10"/>
+          <w:szCs w:val="10"/>
         </w:rPr>
       </w:pPr>
     </w:p>
@@ -1158,7 +1166,7 @@
       <w:pPr>
         <w:pStyle w:val="Heading2"/>
         <w:rPr>
-          <w:rFonts w:ascii="Times New Roman" w:hAnsi="Times New Roman" w:cs="Times New Roman" w:hint="cs"/>
+          <w:rFonts w:ascii="Times New Roman" w:hAnsi="Times New Roman" w:cs="Times New Roman"/>
           <w:color w:val="000000" w:themeColor="text1"/>
           <w:sz w:val="24"/>
           <w:szCs w:val="24"/>
@@ -1180,16 +1188,23 @@
       <w:pPr>
         <w:spacing w:before="60" w:after="60"/>
         <w:rPr>
-          <w:rFonts w:ascii="Times New Roman" w:hAnsi="Times New Roman" w:cs="Times New Roman" w:hint="cs"/>
-          <w:color w:val="000000" w:themeColor="text1"/>
-        </w:rPr>
-      </w:pPr>
+          <w:rFonts w:ascii="Times New Roman" w:hAnsi="Times New Roman" w:cs="Times New Roman"/>
+          <w:color w:val="000000" w:themeColor="text1"/>
+        </w:rPr>
+      </w:pPr>
+      <w:r>
+        <w:rPr>
+          <w:rFonts w:ascii="Times New Roman" w:eastAsia="Calibri" w:hAnsi="Times New Roman" w:cs="Times New Roman"/>
+          <w:color w:val="000000" w:themeColor="text1"/>
+        </w:rPr>
+        <w:t>Four</w:t>
+      </w:r>
       <w:r>
         <w:rPr>
           <w:rFonts w:ascii="Times New Roman" w:eastAsia="Calibri" w:hAnsi="Times New Roman" w:cs="Times New Roman" w:hint="cs"/>
           <w:color w:val="000000" w:themeColor="text1"/>
         </w:rPr>
-        <w:t>Two reward functions are composed additively. This design allows each signal to target a distinct failure mode independently.</w:t>
+        <w:t xml:space="preserve"> reward functions are composed additively. This design allows each signal to target a distinct failure mode independently.</w:t>
       </w:r>
     </w:p>
     <w:p>
@@ -1201,7 +1216,7 @@
         </w:numPr>
         <w:spacing w:before="200" w:after="80"/>
         <w:rPr>
-          <w:rFonts w:ascii="Times New Roman" w:hAnsi="Times New Roman" w:cs="Times New Roman" w:hint="cs"/>
+          <w:rFonts w:ascii="Times New Roman" w:hAnsi="Times New Roman" w:cs="Times New Roman"/>
           <w:color w:val="000000" w:themeColor="text1"/>
         </w:rPr>
       </w:pPr>
@@ -1221,7 +1236,7 @@
         <w:spacing w:before="60" w:after="60"/>
         <w:ind w:left="1440"/>
         <w:rPr>
-          <w:rFonts w:ascii="Times New Roman" w:hAnsi="Times New Roman" w:cs="Times New Roman" w:hint="cs"/>
+          <w:rFonts w:ascii="Times New Roman" w:hAnsi="Times New Roman" w:cs="Times New Roman"/>
           <w:color w:val="000000" w:themeColor="text1"/>
         </w:rPr>
       </w:pPr>
@@ -1249,108 +1264,250 @@
         </w:numPr>
         <w:spacing w:before="200" w:after="80"/>
         <w:rPr>
-          <w:rFonts w:ascii="Times New Roman" w:hAnsi="Times New Roman" w:cs="Times New Roman" w:hint="cs"/>
-          <w:color w:val="000000" w:themeColor="text1"/>
-        </w:rPr>
-      </w:pPr>
+          <w:rFonts w:ascii="Times New Roman" w:hAnsi="Times New Roman" w:cs="Times New Roman"/>
+          <w:color w:val="000000" w:themeColor="text1"/>
+        </w:rPr>
+      </w:pPr>
+      <w:r>
+        <w:rPr>
+          <w:rFonts w:ascii="Times New Roman" w:eastAsia="Calibri" w:hAnsi="Times New Roman" w:cs="Times New Roman"/>
+          <w:b/>
+          <w:bCs/>
+          <w:color w:val="000000" w:themeColor="text1"/>
+        </w:rPr>
+        <w:t>Reward Function 2 — Tool Selection Correctness Reward (</w:t>
+      </w:r>
+      <w:proofErr w:type="spellStart"/>
+      <w:r>
+        <w:rPr>
+          <w:rFonts w:ascii="Times New Roman" w:eastAsia="Calibri" w:hAnsi="Times New Roman" w:cs="Times New Roman"/>
+          <w:b/>
+          <w:bCs/>
+          <w:color w:val="000000" w:themeColor="text1"/>
+        </w:rPr>
+        <w:t>correctness_reward_func</w:t>
+      </w:r>
+      <w:proofErr w:type="spellEnd"/>
+      <w:r>
+        <w:rPr>
+          <w:rFonts w:ascii="Times New Roman" w:eastAsia="Calibri" w:hAnsi="Times New Roman" w:cs="Times New Roman"/>
+          <w:b/>
+          <w:bCs/>
+          <w:color w:val="000000" w:themeColor="text1"/>
+        </w:rPr>
+        <w:t>)</w:t>
+      </w:r>
+      <w:r>
+        <w:rPr>
+          <w:rFonts w:ascii="Times New Roman" w:eastAsia="Calibri" w:hAnsi="Times New Roman" w:cs="Times New Roman"/>
+          <w:b/>
+          <w:bCs/>
+          <w:color w:val="000000" w:themeColor="text1"/>
+        </w:rPr>
+        <w:br/>
+      </w:r>
+      <w:r>
+        <w:rPr>
+          <w:rFonts w:ascii="Times New Roman" w:hAnsi="Times New Roman" w:cs="Times New Roman"/>
+          <w:color w:val="000000" w:themeColor="text1"/>
+        </w:rPr>
+        <w:t xml:space="preserve">            </w:t>
+      </w:r>
+      <w:r>
+        <w:rPr>
+          <w:rFonts w:ascii="Times New Roman" w:hAnsi="Times New Roman" w:cs="Times New Roman"/>
+          <w:color w:val="000000" w:themeColor="text1"/>
+        </w:rPr>
+        <w:t>Targets: hallucinated tool names, wrong API selection, missing tool calls.</w:t>
+      </w:r>
+      <w:r>
+        <w:rPr>
+          <w:rFonts w:ascii="Times New Roman" w:hAnsi="Times New Roman" w:cs="Times New Roman"/>
+          <w:color w:val="000000" w:themeColor="text1"/>
+        </w:rPr>
+        <w:br/>
+      </w:r>
+    </w:p>
+    <w:p>
+      <w:pPr>
+        <w:pStyle w:val="ListParagraph"/>
+        <w:numPr>
+          <w:ilvl w:val="0"/>
+          <w:numId w:val="7"/>
+        </w:numPr>
+        <w:spacing w:before="200" w:after="80"/>
+        <w:rPr>
+          <w:rFonts w:ascii="Times New Roman" w:hAnsi="Times New Roman" w:cs="Times New Roman"/>
+          <w:color w:val="000000" w:themeColor="text1"/>
+        </w:rPr>
+      </w:pPr>
+      <w:r>
+        <w:rPr>
+          <w:rFonts w:ascii="Times New Roman" w:hAnsi="Times New Roman" w:cs="Times New Roman"/>
+          <w:b/>
+          <w:bCs/>
+          <w:color w:val="000000" w:themeColor="text1"/>
+        </w:rPr>
+        <w:t>Reward Function 3</w:t>
+      </w:r>
+      <w:r>
+        <w:rPr>
+          <w:rFonts w:ascii="Times New Roman" w:hAnsi="Times New Roman" w:cs="Times New Roman"/>
+          <w:color w:val="000000" w:themeColor="text1"/>
+        </w:rPr>
+        <w:t xml:space="preserve"> — </w:t>
+      </w:r>
+      <w:r>
+        <w:rPr>
+          <w:rFonts w:ascii="Times New Roman" w:hAnsi="Times New Roman" w:cs="Times New Roman"/>
+          <w:b/>
+          <w:bCs/>
+          <w:color w:val="000000" w:themeColor="text1"/>
+        </w:rPr>
+        <w:t>Argument Fidelity Reward (</w:t>
+      </w:r>
+      <w:proofErr w:type="spellStart"/>
+      <w:r>
+        <w:rPr>
+          <w:rFonts w:ascii="Times New Roman" w:hAnsi="Times New Roman" w:cs="Times New Roman"/>
+          <w:b/>
+          <w:bCs/>
+          <w:color w:val="000000" w:themeColor="text1"/>
+        </w:rPr>
+        <w:t>argument_fidelity_reward_func</w:t>
+      </w:r>
+      <w:proofErr w:type="spellEnd"/>
+      <w:r>
+        <w:rPr>
+          <w:rFonts w:ascii="Times New Roman" w:hAnsi="Times New Roman" w:cs="Times New Roman"/>
+          <w:b/>
+          <w:bCs/>
+          <w:color w:val="000000" w:themeColor="text1"/>
+        </w:rPr>
+        <w:t>)</w:t>
+      </w:r>
+      <w:r>
+        <w:rPr>
+          <w:rFonts w:ascii="Times New Roman" w:hAnsi="Times New Roman" w:cs="Times New Roman"/>
+          <w:b/>
+          <w:bCs/>
+          <w:color w:val="000000" w:themeColor="text1"/>
+        </w:rPr>
+        <w:br/>
+      </w:r>
+      <w:r>
+        <w:rPr>
+          <w:rFonts w:ascii="Times New Roman" w:hAnsi="Times New Roman" w:cs="Times New Roman"/>
+          <w:color w:val="000000" w:themeColor="text1"/>
+        </w:rPr>
+        <w:t xml:space="preserve">            </w:t>
+      </w:r>
+      <w:r>
+        <w:rPr>
+          <w:rFonts w:ascii="Times New Roman" w:hAnsi="Times New Roman" w:cs="Times New Roman"/>
+          <w:color w:val="000000" w:themeColor="text1"/>
+        </w:rPr>
+        <w:t>Targets: correct tool name, wrong or invented argument values (e.g</w:t>
+      </w:r>
+      <w:r>
+        <w:rPr>
+          <w:rFonts w:ascii="Times New Roman" w:hAnsi="Times New Roman" w:cs="Times New Roman"/>
+          <w:color w:val="000000" w:themeColor="text1"/>
+        </w:rPr>
+        <w:t xml:space="preserve">. </w:t>
+      </w:r>
+      <w:r>
+        <w:rPr>
+          <w:rFonts w:ascii="Times New Roman" w:hAnsi="Times New Roman" w:cs="Times New Roman"/>
+          <w:color w:val="000000" w:themeColor="text1"/>
+        </w:rPr>
+        <w:t>hallucinated order IDs).</w:t>
+      </w:r>
+      <w:r>
+        <w:rPr>
+          <w:rFonts w:ascii="Times New Roman" w:hAnsi="Times New Roman" w:cs="Times New Roman"/>
+          <w:color w:val="000000" w:themeColor="text1"/>
+        </w:rPr>
+        <w:br/>
+      </w:r>
+    </w:p>
+    <w:p>
+      <w:pPr>
+        <w:pStyle w:val="ListParagraph"/>
+        <w:numPr>
+          <w:ilvl w:val="0"/>
+          <w:numId w:val="7"/>
+        </w:numPr>
+        <w:spacing w:before="200" w:after="80"/>
+        <w:rPr>
+          <w:rFonts w:ascii="Times New Roman" w:hAnsi="Times New Roman" w:cs="Times New Roman"/>
+          <w:color w:val="000000" w:themeColor="text1"/>
+        </w:rPr>
+      </w:pPr>
+      <w:r>
+        <w:rPr>
+          <w:rFonts w:ascii="Times New Roman" w:hAnsi="Times New Roman" w:cs="Times New Roman"/>
+          <w:b/>
+          <w:bCs/>
+          <w:color w:val="000000" w:themeColor="text1"/>
+        </w:rPr>
+        <w:t>Reward Function 4 — Trajectory Ordering Reward (</w:t>
+      </w:r>
+      <w:proofErr w:type="spellStart"/>
+      <w:r>
+        <w:rPr>
+          <w:rFonts w:ascii="Times New Roman" w:hAnsi="Times New Roman" w:cs="Times New Roman"/>
+          <w:b/>
+          <w:bCs/>
+          <w:color w:val="000000" w:themeColor="text1"/>
+        </w:rPr>
+        <w:t>trajectory_order_reward_func</w:t>
+      </w:r>
+      <w:proofErr w:type="spellEnd"/>
+      <w:r>
+        <w:rPr>
+          <w:rFonts w:ascii="Times New Roman" w:hAnsi="Times New Roman" w:cs="Times New Roman"/>
+          <w:b/>
+          <w:bCs/>
+          <w:color w:val="000000" w:themeColor="text1"/>
+        </w:rPr>
+        <w:t>)</w:t>
+      </w:r>
+      <w:r>
+        <w:rPr>
+          <w:rFonts w:ascii="Times New Roman" w:hAnsi="Times New Roman" w:cs="Times New Roman"/>
+          <w:color w:val="000000" w:themeColor="text1"/>
+        </w:rPr>
+        <w:br/>
+      </w:r>
+      <w:r>
+        <w:rPr>
+          <w:rFonts w:ascii="Times New Roman" w:eastAsia="Calibri" w:hAnsi="Times New Roman" w:cs="Times New Roman"/>
+          <w:color w:val="000000" w:themeColor="text1"/>
+        </w:rPr>
+        <w:t xml:space="preserve">               </w:t>
+      </w:r>
       <w:r>
         <w:rPr>
           <w:rFonts w:ascii="Times New Roman" w:eastAsia="Calibri" w:hAnsi="Times New Roman" w:cs="Times New Roman" w:hint="cs"/>
-          <w:b/>
-          <w:bCs/>
-          <w:color w:val="000000" w:themeColor="text1"/>
-        </w:rPr>
-        <w:t>Reward Function 2 — Correctness / Trajectory Reward (correctness_reward_func)</w:t>
-      </w:r>
-    </w:p>
-    <w:p>
-      <w:pPr>
-        <w:pStyle w:val="ListParagraph"/>
-        <w:spacing w:before="60" w:after="60"/>
-        <w:ind w:left="1440"/>
+          <w:color w:val="000000" w:themeColor="text1"/>
+        </w:rPr>
+        <w:t xml:space="preserve">Targets: </w:t>
+      </w:r>
+      <w:r>
         <w:rPr>
           <w:rFonts w:ascii="Times New Roman" w:eastAsia="Calibri" w:hAnsi="Times New Roman" w:cs="Times New Roman"/>
           <w:color w:val="000000" w:themeColor="text1"/>
         </w:rPr>
-      </w:pPr>
+        <w:t>correct tools called in the wrong sequence</w:t>
+      </w:r>
       <w:r>
         <w:rPr>
           <w:rFonts w:ascii="Times New Roman" w:eastAsia="Calibri" w:hAnsi="Times New Roman" w:cs="Times New Roman" w:hint="cs"/>
           <w:color w:val="000000" w:themeColor="text1"/>
         </w:rPr>
-        <w:t>Targets: wrong tool selection, hallucinated tool calls, incorrect sequencing.</w:t>
-      </w:r>
-    </w:p>
-    <w:p>
-      <w:pPr>
-        <w:pStyle w:val="ListParagraph"/>
-        <w:rPr>
-          <w:rFonts w:ascii="Times New Roman" w:hAnsi="Times New Roman" w:cs="Times New Roman"/>
-        </w:rPr>
-      </w:pPr>
-    </w:p>
-    <w:p>
-      <w:pPr>
-        <w:pStyle w:val="ListParagraph"/>
-        <w:rPr>
-          <w:rFonts w:ascii="Times New Roman" w:hAnsi="Times New Roman" w:cs="Times New Roman"/>
-        </w:rPr>
-      </w:pPr>
-    </w:p>
-    <w:p>
-      <w:pPr>
-        <w:pStyle w:val="ListParagraph"/>
-        <w:rPr>
-          <w:rFonts w:ascii="Times New Roman" w:hAnsi="Times New Roman" w:cs="Times New Roman"/>
-        </w:rPr>
-      </w:pPr>
-    </w:p>
-    <w:p>
-      <w:pPr>
-        <w:pStyle w:val="ListParagraph"/>
-        <w:rPr>
-          <w:rFonts w:ascii="Times New Roman" w:hAnsi="Times New Roman" w:cs="Times New Roman"/>
-        </w:rPr>
-      </w:pPr>
-    </w:p>
-    <w:p>
-      <w:pPr>
-        <w:pStyle w:val="ListParagraph"/>
-        <w:rPr>
-          <w:rFonts w:ascii="Times New Roman" w:hAnsi="Times New Roman" w:cs="Times New Roman"/>
-        </w:rPr>
-      </w:pPr>
-    </w:p>
-    <w:p>
-      <w:pPr>
-        <w:pStyle w:val="ListParagraph"/>
-        <w:rPr>
-          <w:rFonts w:ascii="Times New Roman" w:hAnsi="Times New Roman" w:cs="Times New Roman"/>
-        </w:rPr>
-      </w:pPr>
-    </w:p>
-    <w:p>
-      <w:pPr>
-        <w:rPr>
-          <w:rFonts w:ascii="Times New Roman" w:hAnsi="Times New Roman" w:cs="Times New Roman"/>
-        </w:rPr>
-      </w:pPr>
-    </w:p>
-    <w:p>
-      <w:pPr>
-        <w:pStyle w:val="ListParagraph"/>
-        <w:rPr>
-          <w:rFonts w:ascii="Times New Roman" w:hAnsi="Times New Roman" w:cs="Times New Roman"/>
-        </w:rPr>
-      </w:pPr>
-    </w:p>
-    <w:p>
-      <w:pPr>
-        <w:pStyle w:val="ListParagraph"/>
-        <w:rPr>
-          <w:rFonts w:ascii="Times New Roman" w:hAnsi="Times New Roman" w:cs="Times New Roman" w:hint="cs"/>
-        </w:rPr>
-      </w:pPr>
+        <w:t>, incorrect sequencing.</w:t>
+      </w:r>
     </w:p>
     <w:p>
       <w:pPr>
@@ -1372,13 +1529,17 @@
         <w:lastRenderedPageBreak/>
         <w:t xml:space="preserve">Model Selection and training plan: </w:t>
       </w:r>
-      <w:r>
-        <w:rPr>
-          <w:b/>
-          <w:bCs/>
-        </w:rPr>
-        <w:br/>
-      </w:r>
+    </w:p>
+    <w:p>
+      <w:pPr>
+        <w:pStyle w:val="ListParagraph"/>
+        <w:rPr>
+          <w:b/>
+          <w:bCs/>
+          <w:sz w:val="11"/>
+          <w:szCs w:val="11"/>
+        </w:rPr>
+      </w:pPr>
     </w:p>
     <w:tbl>
       <w:tblPr>
@@ -1438,6 +1599,8 @@
               <w:rPr>
                 <w:b/>
                 <w:bCs/>
+                <w:sz w:val="16"/>
+                <w:szCs w:val="16"/>
               </w:rPr>
             </w:pPr>
           </w:p>
@@ -1464,6 +1627,10 @@
               <w:pStyle w:val="ListParagraph"/>
               <w:spacing w:line="276" w:lineRule="auto"/>
               <w:ind w:left="0"/>
+              <w:rPr>
+                <w:sz w:val="16"/>
+                <w:szCs w:val="16"/>
+              </w:rPr>
             </w:pPr>
           </w:p>
           <w:p>
@@ -1514,16 +1681,7 @@
                 <w:sz w:val="20"/>
                 <w:szCs w:val="20"/>
               </w:rPr>
-              <w:t xml:space="preserve">It’s a </w:t>
-            </w:r>
-            <w:r>
-              <w:rPr>
-                <w:i/>
-                <w:iCs/>
-                <w:sz w:val="20"/>
-                <w:szCs w:val="20"/>
-              </w:rPr>
-              <w:t>robust zero-shot reasoning and native understanding of tool</w:t>
+              <w:t>It’s a robust zero-shot reasoning and native understanding of tool</w:t>
             </w:r>
             <w:r>
               <w:rPr>
@@ -1541,16 +1699,7 @@
                 <w:sz w:val="20"/>
                 <w:szCs w:val="20"/>
               </w:rPr>
-              <w:t>-calling schemas</w:t>
-            </w:r>
-            <w:r>
-              <w:rPr>
-                <w:i/>
-                <w:iCs/>
-                <w:sz w:val="20"/>
-                <w:szCs w:val="20"/>
-              </w:rPr>
-              <w:t>.</w:t>
+              <w:t>-calling schemas.</w:t>
             </w:r>
             <w:r>
               <w:rPr>
@@ -1616,6 +1765,8 @@
               <w:rPr>
                 <w:b/>
                 <w:bCs/>
+                <w:sz w:val="18"/>
+                <w:szCs w:val="18"/>
               </w:rPr>
             </w:pPr>
           </w:p>
@@ -1642,6 +1793,10 @@
               <w:pStyle w:val="ListParagraph"/>
               <w:spacing w:line="276" w:lineRule="auto"/>
               <w:ind w:left="0"/>
+              <w:rPr>
+                <w:sz w:val="15"/>
+                <w:szCs w:val="15"/>
+              </w:rPr>
             </w:pPr>
           </w:p>
           <w:p>
@@ -1683,16 +1838,7 @@
                 <w:sz w:val="20"/>
                 <w:szCs w:val="20"/>
               </w:rPr>
-              <w:t>Eliminates the need for a separate critic model by normalizing rewards across multiple sampled generations</w:t>
-            </w:r>
-            <w:r>
-              <w:rPr>
-                <w:i/>
-                <w:iCs/>
-                <w:sz w:val="20"/>
-                <w:szCs w:val="20"/>
-              </w:rPr>
-              <w:t>.</w:t>
+              <w:t>Eliminates the need for a separate critic model by normalizing rewards across multiple sampled generations.</w:t>
             </w:r>
             <w:r>
               <w:rPr>
@@ -1771,8 +1917,8 @@
               <w:spacing w:line="276" w:lineRule="auto"/>
               <w:ind w:left="0"/>
               <w:rPr>
-                <w:sz w:val="21"/>
-                <w:szCs w:val="21"/>
+                <w:sz w:val="10"/>
+                <w:szCs w:val="10"/>
               </w:rPr>
             </w:pPr>
           </w:p>
@@ -1874,6 +2020,10 @@
             <w:pPr>
               <w:pStyle w:val="ListParagraph"/>
               <w:spacing w:line="276" w:lineRule="auto"/>
+              <w:rPr>
+                <w:sz w:val="10"/>
+                <w:szCs w:val="10"/>
+              </w:rPr>
             </w:pPr>
           </w:p>
           <w:p>
@@ -1942,13 +2092,7 @@
             </w:r>
             <w:proofErr w:type="spellStart"/>
             <w:r>
-              <w:t>Adamw</w:t>
-            </w:r>
-            <w:r>
-              <w:t>_</w:t>
-            </w:r>
-            <w:r>
-              <w:t>torch</w:t>
+              <w:t>Adamw_torch</w:t>
             </w:r>
             <w:proofErr w:type="spellEnd"/>
           </w:p>
@@ -2018,8 +2162,8 @@
             <w:pPr>
               <w:spacing w:line="276" w:lineRule="auto"/>
               <w:rPr>
-                <w:sz w:val="8"/>
-                <w:szCs w:val="8"/>
+                <w:sz w:val="6"/>
+                <w:szCs w:val="6"/>
               </w:rPr>
             </w:pPr>
           </w:p>
@@ -2079,21 +2223,7 @@
                 <w:b/>
                 <w:bCs/>
               </w:rPr>
-              <w:t xml:space="preserve">+0.5 </w:t>
-            </w:r>
-            <w:r>
-              <w:rPr>
-                <w:b/>
-                <w:bCs/>
-              </w:rPr>
-              <w:t>- +</w:t>
-            </w:r>
-            <w:r>
-              <w:rPr>
-                <w:b/>
-                <w:bCs/>
-              </w:rPr>
-              <w:t xml:space="preserve">1.0 </w:t>
+              <w:t xml:space="preserve">+0.5 - +1.0 </w:t>
             </w:r>
             <w:r>
               <w:t>for valid JSON arrays and correct tool selection.</w:t>
@@ -2103,6 +2233,10 @@
             <w:pPr>
               <w:pStyle w:val="ListParagraph"/>
               <w:spacing w:line="276" w:lineRule="auto"/>
+              <w:rPr>
+                <w:sz w:val="13"/>
+                <w:szCs w:val="13"/>
+              </w:rPr>
             </w:pPr>
           </w:p>
           <w:p>
@@ -2135,8 +2269,8 @@
             <w:pPr>
               <w:spacing w:line="276" w:lineRule="auto"/>
               <w:rPr>
-                <w:sz w:val="13"/>
-                <w:szCs w:val="13"/>
+                <w:sz w:val="10"/>
+                <w:szCs w:val="10"/>
               </w:rPr>
             </w:pPr>
           </w:p>
@@ -2231,7 +2365,191 @@
         </w:tc>
       </w:tr>
     </w:tbl>
-    <w:p/>
+    <w:p>
+      <w:pPr>
+        <w:rPr>
+          <w:rFonts w:ascii="Times New Roman" w:hAnsi="Times New Roman" w:cs="Times New Roman"/>
+          <w:sz w:val="16"/>
+          <w:szCs w:val="16"/>
+        </w:rPr>
+      </w:pPr>
+    </w:p>
+    <w:p>
+      <w:pPr>
+        <w:ind w:left="720"/>
+        <w:rPr>
+          <w:rFonts w:ascii="Times New Roman" w:hAnsi="Times New Roman" w:cs="Times New Roman"/>
+          <w:sz w:val="21"/>
+          <w:szCs w:val="21"/>
+        </w:rPr>
+      </w:pPr>
+      <w:r>
+        <w:rPr>
+          <w:rFonts w:ascii="Times New Roman" w:hAnsi="Times New Roman" w:cs="Times New Roman" w:hint="cs"/>
+          <w:b/>
+          <w:bCs/>
+          <w:sz w:val="21"/>
+          <w:szCs w:val="21"/>
+          <w:u w:val="single"/>
+        </w:rPr>
+        <w:t xml:space="preserve">Overfitting mitigation: </w:t>
+      </w:r>
+      <w:r>
+        <w:rPr>
+          <w:rFonts w:ascii="Times New Roman" w:hAnsi="Times New Roman" w:cs="Times New Roman" w:hint="cs"/>
+          <w:sz w:val="21"/>
+          <w:szCs w:val="21"/>
+        </w:rPr>
+        <w:t xml:space="preserve">With 160 training samples over 75 epochs, </w:t>
+      </w:r>
+      <w:r>
+        <w:rPr>
+          <w:rFonts w:ascii="Times New Roman" w:hAnsi="Times New Roman" w:cs="Times New Roman" w:hint="cs"/>
+          <w:sz w:val="21"/>
+          <w:szCs w:val="21"/>
+          <w:u w:val="single"/>
+        </w:rPr>
+        <w:t>overfitting is a real</w:t>
+      </w:r>
+      <w:r>
+        <w:rPr>
+          <w:rFonts w:ascii="Times New Roman" w:hAnsi="Times New Roman" w:cs="Times New Roman"/>
+          <w:sz w:val="21"/>
+          <w:szCs w:val="21"/>
+          <w:u w:val="single"/>
+        </w:rPr>
+        <w:t xml:space="preserve"> possible</w:t>
+      </w:r>
+      <w:r>
+        <w:rPr>
+          <w:rFonts w:ascii="Times New Roman" w:hAnsi="Times New Roman" w:cs="Times New Roman" w:hint="cs"/>
+          <w:sz w:val="21"/>
+          <w:szCs w:val="21"/>
+          <w:u w:val="single"/>
+        </w:rPr>
+        <w:t xml:space="preserve"> risk</w:t>
+      </w:r>
+      <w:r>
+        <w:rPr>
+          <w:rFonts w:ascii="Times New Roman" w:hAnsi="Times New Roman" w:cs="Times New Roman" w:hint="cs"/>
+          <w:b/>
+          <w:bCs/>
+          <w:sz w:val="21"/>
+          <w:szCs w:val="21"/>
+          <w:u w:val="single"/>
+        </w:rPr>
+        <w:t>.</w:t>
+      </w:r>
+      <w:r>
+        <w:rPr>
+          <w:rFonts w:ascii="Times New Roman" w:hAnsi="Times New Roman" w:cs="Times New Roman"/>
+          <w:b/>
+          <w:bCs/>
+          <w:sz w:val="21"/>
+          <w:szCs w:val="21"/>
+          <w:u w:val="single"/>
+        </w:rPr>
+        <w:t xml:space="preserve"> </w:t>
+      </w:r>
+      <w:r>
+        <w:rPr>
+          <w:rFonts w:ascii="Times New Roman" w:hAnsi="Times New Roman" w:cs="Times New Roman"/>
+          <w:sz w:val="21"/>
+          <w:szCs w:val="21"/>
+        </w:rPr>
+        <w:t>To handle that</w:t>
+      </w:r>
+      <w:r>
+        <w:rPr>
+          <w:rFonts w:ascii="Times New Roman" w:hAnsi="Times New Roman" w:cs="Times New Roman"/>
+          <w:b/>
+          <w:bCs/>
+          <w:sz w:val="21"/>
+          <w:szCs w:val="21"/>
+        </w:rPr>
+        <w:t>:</w:t>
+      </w:r>
+      <w:r>
+        <w:rPr>
+          <w:rFonts w:ascii="Times New Roman" w:hAnsi="Times New Roman" w:cs="Times New Roman"/>
+          <w:sz w:val="21"/>
+          <w:szCs w:val="21"/>
+        </w:rPr>
+        <w:t xml:space="preserve"> </w:t>
+      </w:r>
+      <w:r>
+        <w:rPr>
+          <w:rFonts w:ascii="Times New Roman" w:hAnsi="Times New Roman" w:cs="Times New Roman"/>
+          <w:sz w:val="21"/>
+          <w:szCs w:val="21"/>
+        </w:rPr>
+        <w:t>(</w:t>
+      </w:r>
+      <w:r>
+        <w:rPr>
+          <w:rFonts w:ascii="Times New Roman" w:hAnsi="Times New Roman" w:cs="Times New Roman" w:hint="cs"/>
+          <w:sz w:val="21"/>
+          <w:szCs w:val="21"/>
+        </w:rPr>
+        <w:t xml:space="preserve">1) Validation reward is tracked every 5 steps on the 20-sample </w:t>
+      </w:r>
+      <w:r>
+        <w:rPr>
+          <w:rFonts w:ascii="Times New Roman" w:hAnsi="Times New Roman" w:cs="Times New Roman"/>
+          <w:sz w:val="21"/>
+          <w:szCs w:val="21"/>
+        </w:rPr>
+        <w:t>v</w:t>
+      </w:r>
+      <w:r>
+        <w:rPr>
+          <w:rFonts w:ascii="Times New Roman" w:hAnsi="Times New Roman" w:cs="Times New Roman"/>
+          <w:sz w:val="21"/>
+          <w:szCs w:val="21"/>
+        </w:rPr>
+        <w:t>al</w:t>
+      </w:r>
+      <w:r>
+        <w:rPr>
+          <w:rFonts w:ascii="Times New Roman" w:hAnsi="Times New Roman" w:cs="Times New Roman" w:hint="cs"/>
+          <w:sz w:val="21"/>
+          <w:szCs w:val="21"/>
+        </w:rPr>
+        <w:t xml:space="preserve"> split</w:t>
+      </w:r>
+      <w:r>
+        <w:rPr>
+          <w:rFonts w:ascii="Times New Roman" w:hAnsi="Times New Roman" w:cs="Times New Roman"/>
+          <w:sz w:val="21"/>
+          <w:szCs w:val="21"/>
+        </w:rPr>
+        <w:t>,</w:t>
+      </w:r>
+      <w:r>
+        <w:rPr>
+          <w:rFonts w:ascii="Times New Roman" w:hAnsi="Times New Roman" w:cs="Times New Roman" w:hint="cs"/>
+          <w:sz w:val="21"/>
+          <w:szCs w:val="21"/>
+        </w:rPr>
+        <w:t xml:space="preserve"> training halts if val reward drops for 3 consecutive checkpoints. (</w:t>
+      </w:r>
+      <w:r>
+        <w:rPr>
+          <w:rFonts w:ascii="Times New Roman" w:hAnsi="Times New Roman" w:cs="Times New Roman"/>
+          <w:sz w:val="21"/>
+          <w:szCs w:val="21"/>
+        </w:rPr>
+        <w:t>2</w:t>
+      </w:r>
+      <w:r>
+        <w:rPr>
+          <w:rFonts w:ascii="Times New Roman" w:hAnsi="Times New Roman" w:cs="Times New Roman" w:hint="cs"/>
+          <w:sz w:val="21"/>
+          <w:szCs w:val="21"/>
+        </w:rPr>
+        <w:t>) GRPO beta acts as implicit regularization against reward hacking.</w:t>
+      </w:r>
+    </w:p>
     <w:p>
       <w:pPr>
         <w:rPr>
@@ -2307,20 +2625,14 @@
         <w:rPr>
           <w:rFonts w:ascii="Times New Roman" w:hAnsi="Times New Roman" w:cs="Times New Roman" w:hint="cs"/>
         </w:rPr>
-        <w:t xml:space="preserve">ccess: </w:t>
-      </w:r>
-      <w:r>
-        <w:rPr>
-          <w:rFonts w:ascii="Times New Roman" w:hAnsi="Times New Roman" w:cs="Times New Roman" w:hint="cs"/>
-        </w:rPr>
-        <w:t>michael@afterquery.com</w:t>
+        <w:t>ccess: michael@afterquery.com</w:t>
       </w:r>
     </w:p>
     <w:p>
       <w:pPr>
         <w:pStyle w:val="ListParagraph"/>
         <w:rPr>
-          <w:rFonts w:ascii="Times New Roman" w:hAnsi="Times New Roman" w:cs="Times New Roman" w:hint="cs"/>
+          <w:rFonts w:ascii="Times New Roman" w:hAnsi="Times New Roman" w:cs="Times New Roman"/>
         </w:rPr>
       </w:pPr>
       <w:r>
@@ -2370,6 +2682,9 @@
         <w:jc w:val="center"/>
       </w:pPr>
       <w:r>
+        <w:rPr>
+          <w:noProof/>
+        </w:rPr>
         <w:drawing>
           <wp:inline distT="0" distB="0" distL="0" distR="0" wp14:anchorId="5589E532" wp14:editId="38C467E3">
             <wp:extent cx="2405742" cy="963573"/>
@@ -2411,7 +2726,7 @@
       <w:pPr>
         <w:pStyle w:val="ListParagraph"/>
         <w:rPr>
-          <w:rFonts w:ascii="Times New Roman" w:hAnsi="Times New Roman" w:cs="Times New Roman" w:hint="cs"/>
+          <w:rFonts w:ascii="Times New Roman" w:hAnsi="Times New Roman" w:cs="Times New Roman"/>
         </w:rPr>
       </w:pPr>
       <w:r>
@@ -2443,6 +2758,9 @@
         <w:t xml:space="preserve">   </w:t>
       </w:r>
       <w:r>
+        <w:rPr>
+          <w:noProof/>
+        </w:rPr>
         <w:drawing>
           <wp:inline distT="0" distB="0" distL="0" distR="0" wp14:anchorId="653608F6" wp14:editId="17F52317">
             <wp:extent cx="1081601" cy="2405743"/>
@@ -2489,6 +2807,9 @@
         <w:t xml:space="preserve">     </w:t>
       </w:r>
       <w:r>
+        <w:rPr>
+          <w:noProof/>
+        </w:rPr>
         <w:drawing>
           <wp:inline distT="0" distB="0" distL="0" distR="0" wp14:anchorId="1A3707AD" wp14:editId="24CC56B1">
             <wp:extent cx="1107266" cy="2438400"/>
@@ -2535,6 +2856,9 @@
         <w:t xml:space="preserve">       </w:t>
       </w:r>
       <w:r>
+        <w:rPr>
+          <w:noProof/>
+        </w:rPr>
         <w:drawing>
           <wp:inline distT="0" distB="0" distL="0" distR="0" wp14:anchorId="683B3E83" wp14:editId="1C0ACEC9">
             <wp:extent cx="1078030" cy="2438400"/>
@@ -2589,7 +2913,35 @@
           <w:b/>
           <w:bCs/>
         </w:rPr>
-        <w:t>Optional Strech Goals Completed</w:t>
+        <w:t xml:space="preserve">Optional </w:t>
+      </w:r>
+      <w:r>
+        <w:rPr>
+          <w:b/>
+          <w:bCs/>
+        </w:rPr>
+        <w:t>Stre</w:t>
+      </w:r>
+      <w:r>
+        <w:rPr>
+          <w:b/>
+          <w:bCs/>
+        </w:rPr>
+        <w:t>t</w:t>
+      </w:r>
+      <w:r>
+        <w:rPr>
+          <w:b/>
+          <w:bCs/>
+        </w:rPr>
+        <w:t>ch</w:t>
+      </w:r>
+      <w:r>
+        <w:rPr>
+          <w:b/>
+          <w:bCs/>
+        </w:rPr>
+        <w:t xml:space="preserve"> Goals Completed</w:t>
       </w:r>
       <w:r>
         <w:rPr>
@@ -2652,7 +3004,7 @@
         <w:pStyle w:val="ListParagraph"/>
         <w:ind w:left="1440"/>
         <w:rPr>
-          <w:rFonts w:ascii="Times New Roman" w:hAnsi="Times New Roman" w:cs="Times New Roman" w:hint="cs"/>
+          <w:rFonts w:ascii="Times New Roman" w:hAnsi="Times New Roman" w:cs="Times New Roman"/>
         </w:rPr>
       </w:pPr>
       <w:r>
@@ -2742,7 +3094,7 @@
         <w:pStyle w:val="ListParagraph"/>
         <w:ind w:left="1440"/>
         <w:rPr>
-          <w:rFonts w:ascii="Times New Roman" w:hAnsi="Times New Roman" w:cs="Times New Roman" w:hint="cs"/>
+          <w:rFonts w:ascii="Times New Roman" w:hAnsi="Times New Roman" w:cs="Times New Roman"/>
         </w:rPr>
       </w:pPr>
       <w:r>
@@ -2763,7 +3115,7 @@
         <w:pStyle w:val="ListParagraph"/>
         <w:ind w:left="1440"/>
         <w:rPr>
-          <w:rFonts w:ascii="Times New Roman" w:hAnsi="Times New Roman" w:cs="Times New Roman" w:hint="cs"/>
+          <w:rFonts w:ascii="Times New Roman" w:hAnsi="Times New Roman" w:cs="Times New Roman"/>
         </w:rPr>
       </w:pPr>
       <w:r>
@@ -2794,7 +3146,19 @@
         <w:rPr>
           <w:rFonts w:ascii="Times New Roman" w:hAnsi="Times New Roman" w:cs="Times New Roman" w:hint="cs"/>
         </w:rPr>
-        <w:t>ech + Synthetic data</w:t>
+        <w:t>e</w:t>
+      </w:r>
+      <w:r>
+        <w:rPr>
+          <w:rFonts w:ascii="Times New Roman" w:hAnsi="Times New Roman" w:cs="Times New Roman"/>
+        </w:rPr>
+        <w:t>n</w:t>
+      </w:r>
+      <w:r>
+        <w:rPr>
+          <w:rFonts w:ascii="Times New Roman" w:hAnsi="Times New Roman" w:cs="Times New Roman" w:hint="cs"/>
+        </w:rPr>
+        <w:t>ch + Synthetic data</w:t>
       </w:r>
       <w:r>
         <w:rPr>
@@ -2843,7 +3207,7 @@
       <w:pPr>
         <w:pStyle w:val="ListParagraph"/>
         <w:rPr>
-          <w:rFonts w:ascii="Times New Roman" w:hAnsi="Times New Roman" w:cs="Times New Roman" w:hint="cs"/>
+          <w:rFonts w:ascii="Times New Roman" w:hAnsi="Times New Roman" w:cs="Times New Roman"/>
           <w:b/>
           <w:bCs/>
         </w:rPr>
@@ -2943,19 +3307,7 @@
         <w:rPr>
           <w:rFonts w:ascii="Times New Roman" w:hAnsi="Times New Roman" w:cs="Times New Roman" w:hint="cs"/>
         </w:rPr>
-        <w:t xml:space="preserve">, one tool at a time. Increased learning rate to 3e-5 or 5e-5. Increase GRPO generations (to </w:t>
-      </w:r>
-      <w:r>
-        <w:rPr>
-          <w:rFonts w:ascii="Times New Roman" w:hAnsi="Times New Roman" w:cs="Times New Roman" w:hint="cs"/>
-        </w:rPr>
-        <w:t>8 or 16</w:t>
-      </w:r>
-      <w:r>
-        <w:rPr>
-          <w:rFonts w:ascii="Times New Roman" w:hAnsi="Times New Roman" w:cs="Times New Roman" w:hint="cs"/>
-        </w:rPr>
-        <w:t xml:space="preserve">) and batch sizes (to 4 or 8), as now we have plenty of VRAM. </w:t>
+        <w:t xml:space="preserve">, one tool at a time. Increased learning rate to 3e-5 or 5e-5. Increase GRPO generations (to 8 or 16) and batch sizes (to 4 or 8), as now we have plenty of VRAM. </w:t>
       </w:r>
       <w:r>
         <w:rPr>
@@ -2983,7 +3335,21 @@
           <w:b/>
           <w:bCs/>
         </w:rPr>
-        <w:t xml:space="preserve">Strech </w:t>
+        <w:t>Stre</w:t>
+      </w:r>
+      <w:r>
+        <w:rPr>
+          <w:b/>
+          <w:bCs/>
+        </w:rPr>
+        <w:t>t</w:t>
+      </w:r>
+      <w:r>
+        <w:rPr>
+          <w:b/>
+          <w:bCs/>
+        </w:rPr>
+        <w:t xml:space="preserve">ch </w:t>
       </w:r>
       <w:r>
         <w:rPr>
@@ -2999,6 +3365,8 @@
         <w:rPr>
           <w:b/>
           <w:bCs/>
+          <w:sz w:val="16"/>
+          <w:szCs w:val="16"/>
         </w:rPr>
       </w:pPr>
     </w:p>
@@ -3006,7 +3374,8 @@
       <w:pPr>
         <w:pStyle w:val="ListParagraph"/>
         <w:rPr>
-          <w:rFonts w:ascii="Times New Roman" w:hAnsi="Times New Roman" w:cs="Times New Roman" w:hint="cs"/>
+          <w:rFonts w:ascii="Times New Roman" w:eastAsia="Calibri" w:hAnsi="Times New Roman" w:cs="Times New Roman"/>
+          <w:color w:val="374151"/>
         </w:rPr>
       </w:pPr>
       <w:r>
@@ -3051,55 +3420,56 @@
           <w:rFonts w:ascii="Times New Roman" w:eastAsia="Calibri" w:hAnsi="Times New Roman" w:cs="Times New Roman" w:hint="cs"/>
           <w:color w:val="374151"/>
         </w:rPr>
-        <w:t xml:space="preserve">Rather than reporting training loss alone, </w:t>
+        <w:t xml:space="preserve">Rather than reporting training loss alone, I have created </w:t>
       </w:r>
       <w:r>
         <w:rPr>
           <w:rFonts w:ascii="Times New Roman" w:eastAsia="Calibri" w:hAnsi="Times New Roman" w:cs="Times New Roman" w:hint="cs"/>
           <w:color w:val="374151"/>
         </w:rPr>
-        <w:t xml:space="preserve">I have created </w:t>
+        <w:t>a dedicated</w:t>
       </w:r>
       <w:r>
         <w:rPr>
           <w:rFonts w:ascii="Times New Roman" w:eastAsia="Calibri" w:hAnsi="Times New Roman" w:cs="Times New Roman" w:hint="cs"/>
           <w:color w:val="374151"/>
         </w:rPr>
-        <w:t>a dedicated</w:t>
+        <w:t xml:space="preserve"> evaluation.py script </w:t>
+      </w:r>
+      <w:r>
+        <w:rPr>
+          <w:rFonts w:ascii="Times New Roman" w:eastAsia="Calibri" w:hAnsi="Times New Roman" w:cs="Times New Roman"/>
+          <w:color w:val="374151"/>
+        </w:rPr>
+        <w:t xml:space="preserve">that </w:t>
       </w:r>
       <w:r>
         <w:rPr>
           <w:rFonts w:ascii="Times New Roman" w:eastAsia="Calibri" w:hAnsi="Times New Roman" w:cs="Times New Roman" w:hint="cs"/>
           <w:color w:val="374151"/>
         </w:rPr>
-        <w:t xml:space="preserve"> evaluation.py script </w:t>
-      </w:r>
+        <w:t xml:space="preserve">performs a side-by-side comparison of the base model and the RLVR fine-tuned model on identical held-out prompts. </w:t>
+      </w:r>
+    </w:p>
+    <w:p>
+      <w:pPr>
+        <w:pStyle w:val="ListParagraph"/>
+        <w:rPr>
+          <w:rFonts w:ascii="Times New Roman" w:hAnsi="Times New Roman" w:cs="Times New Roman"/>
+        </w:rPr>
+      </w:pPr>
       <w:r>
         <w:rPr>
           <w:rFonts w:ascii="Times New Roman" w:eastAsia="Calibri" w:hAnsi="Times New Roman" w:cs="Times New Roman"/>
           <w:color w:val="374151"/>
         </w:rPr>
-        <w:t xml:space="preserve">that </w:t>
+        <w:br/>
       </w:r>
       <w:r>
         <w:rPr>
           <w:rFonts w:ascii="Times New Roman" w:eastAsia="Calibri" w:hAnsi="Times New Roman" w:cs="Times New Roman" w:hint="cs"/>
           <w:color w:val="374151"/>
         </w:rPr>
-        <w:t xml:space="preserve">performs a side-by-side comparison of the base model and the RLVR fine-tuned model on identical held-out prompts. </w:t>
-      </w:r>
-      <w:r>
-        <w:rPr>
-          <w:rFonts w:ascii="Times New Roman" w:eastAsia="Calibri" w:hAnsi="Times New Roman" w:cs="Times New Roman"/>
-          <w:color w:val="374151"/>
-        </w:rPr>
-        <w:br/>
-      </w:r>
-      <w:r>
-        <w:rPr>
-          <w:rFonts w:ascii="Times New Roman" w:eastAsia="Calibri" w:hAnsi="Times New Roman" w:cs="Times New Roman" w:hint="cs"/>
-          <w:color w:val="374151"/>
-        </w:rPr>
         <w:t>This surfaces the behavioral delta that training loss obscures specifically whether the model has shifted from conversational responses to structured tool-call outputs</w:t>
       </w:r>
     </w:p>
@@ -3107,7 +3477,9 @@
       <w:pPr>
         <w:spacing w:before="80"/>
         <w:rPr>
-          <w:rFonts w:ascii="Times New Roman" w:hAnsi="Times New Roman" w:cs="Times New Roman" w:hint="cs"/>
+          <w:rFonts w:ascii="Times New Roman" w:hAnsi="Times New Roman" w:cs="Times New Roman"/>
+          <w:sz w:val="15"/>
+          <w:szCs w:val="15"/>
         </w:rPr>
       </w:pPr>
     </w:p>
@@ -3134,12 +3506,6 @@
         <w:gridCol w:w="9180"/>
       </w:tblGrid>
       <w:tr>
-        <w:tblPrEx>
-          <w:tblCellMar>
-            <w:top w:w="0" w:type="dxa"/>
-            <w:bottom w:w="0" w:type="dxa"/>
-          </w:tblCellMar>
-        </w:tblPrEx>
         <w:tc>
           <w:tcPr>
             <w:tcW w:w="90" w:type="dxa"/>
@@ -3160,7 +3526,7 @@
           <w:p>
             <w:pPr>
               <w:rPr>
-                <w:rFonts w:ascii="Times New Roman" w:hAnsi="Times New Roman" w:cs="Times New Roman" w:hint="cs"/>
+                <w:rFonts w:ascii="Times New Roman" w:hAnsi="Times New Roman" w:cs="Times New Roman"/>
               </w:rPr>
             </w:pPr>
           </w:p>
@@ -3185,7 +3551,7 @@
           <w:p>
             <w:pPr>
               <w:rPr>
-                <w:rFonts w:ascii="Times New Roman" w:hAnsi="Times New Roman" w:cs="Times New Roman" w:hint="cs"/>
+                <w:rFonts w:ascii="Times New Roman" w:hAnsi="Times New Roman" w:cs="Times New Roman"/>
               </w:rPr>
             </w:pPr>
             <w:r>
@@ -3282,6 +3648,8 @@
       <w:pPr>
         <w:rPr>
           <w:rFonts w:ascii="Times New Roman" w:hAnsi="Times New Roman" w:cs="Times New Roman"/>
+          <w:sz w:val="22"/>
+          <w:szCs w:val="22"/>
         </w:rPr>
       </w:pPr>
       <w:r>
@@ -3311,15 +3679,7 @@
           <w:bCs/>
           <w:u w:val="single"/>
         </w:rPr>
-        <w:t>Explicit GPU Memory Management</w:t>
-      </w:r>
-      <w:r>
-        <w:rPr>
-          <w:b/>
-          <w:bCs/>
-          <w:u w:val="single"/>
-        </w:rPr>
-        <w:t>: Yes</w:t>
+        <w:t>Explicit GPU Memory Management: Yes</w:t>
       </w:r>
     </w:p>
     <w:p>
@@ -3566,26 +3926,14 @@
     <w:p>
       <w:pPr>
         <w:rPr>
-          <w:rFonts w:ascii="Times New Roman" w:hAnsi="Times New Roman" w:cs="Times New Roman" w:hint="cs"/>
-        </w:rPr>
-      </w:pPr>
-      <w:r>
-        <w:rPr>
-          <w:rFonts w:ascii="Times New Roman" w:hAnsi="Times New Roman" w:cs="Times New Roman" w:hint="cs"/>
-        </w:rPr>
-        <w:t xml:space="preserve">Thank you </w:t>
-      </w:r>
-      <w:r>
-        <w:rPr>
-          <w:rFonts w:ascii="Times New Roman" w:hAnsi="Times New Roman" w:cs="Times New Roman" w:hint="cs"/>
-        </w:rPr>
-        <w:t>michael@afterquery.com</w:t>
-      </w:r>
-      <w:r>
-        <w:rPr>
-          <w:rFonts w:ascii="Times New Roman" w:hAnsi="Times New Roman" w:cs="Times New Roman" w:hint="cs"/>
-        </w:rPr>
-        <w:t xml:space="preserve"> for your time!</w:t>
+          <w:rFonts w:ascii="Times New Roman" w:hAnsi="Times New Roman" w:cs="Times New Roman"/>
+        </w:rPr>
+      </w:pPr>
+      <w:r>
+        <w:rPr>
+          <w:rFonts w:ascii="Times New Roman" w:hAnsi="Times New Roman" w:cs="Times New Roman" w:hint="cs"/>
+        </w:rPr>
+        <w:t>Thank you michael@afterquery.com for your time!</w:t>
       </w:r>
     </w:p>
     <w:sectPr>
@@ -5789,6 +6137,19 @@
       <w:shd w:val="clear" w:color="auto" w:fill="E1DFDD"/>
     </w:rPr>
   </w:style>
+  <w:style w:type="paragraph" w:customStyle="1" w:styleId="font-claude-response-body">
+    <w:name w:val="font-claude-response-body"/>
+    <w:basedOn w:val="Normal"/>
+    <w:rsid w:val="00F46301"/>
+    <w:pPr>
+      <w:spacing w:before="100" w:beforeAutospacing="1" w:after="100" w:afterAutospacing="1" w:line="240" w:lineRule="auto"/>
+    </w:pPr>
+    <w:rPr>
+      <w:rFonts w:ascii="Times New Roman" w:eastAsia="Times New Roman" w:hAnsi="Times New Roman" w:cs="Times New Roman"/>
+      <w:kern w:val="0"/>
+      <w14:ligatures w14:val="none"/>
+    </w:rPr>
+  </w:style>
 </w:styles>
 </file>
 

</xml_diff>